<commit_message>
added dosing module and storage module
</commit_message>
<xml_diff>
--- a/Documentation.docx
+++ b/Documentation.docx
@@ -14676,6 +14676,51 @@
           <w:bCs/>
         </w:rPr>
       </w:pPr>
+    </w:p>
+    <w:p>
+      <w:pPr>
+        <w:pStyle w:val="ListParagraph"/>
+        <w:rPr>
+          <w:b/>
+          <w:bCs/>
+        </w:rPr>
+      </w:pPr>
+    </w:p>
+    <w:p>
+      <w:pPr>
+        <w:pStyle w:val="ListParagraph"/>
+        <w:rPr>
+          <w:b/>
+          <w:bCs/>
+        </w:rPr>
+      </w:pPr>
+    </w:p>
+    <w:p>
+      <w:pPr>
+        <w:pStyle w:val="ListParagraph"/>
+        <w:rPr>
+          <w:b/>
+          <w:bCs/>
+        </w:rPr>
+      </w:pPr>
+    </w:p>
+    <w:p>
+      <w:pPr>
+        <w:pStyle w:val="ListParagraph"/>
+        <w:rPr>
+          <w:b/>
+          <w:bCs/>
+        </w:rPr>
+      </w:pPr>
+    </w:p>
+    <w:p>
+      <w:pPr>
+        <w:pStyle w:val="ListParagraph"/>
+        <w:rPr>
+          <w:b/>
+          <w:bCs/>
+        </w:rPr>
+      </w:pPr>
       <w:r>
         <w:rPr>
           <w:b/>
@@ -14717,7 +14762,6 @@
               <w:pStyle w:val="ListParagraph"/>
             </w:pPr>
             <w:r>
-              <w:lastRenderedPageBreak/>
               <w:t>Element</w:t>
             </w:r>
           </w:p>
@@ -14975,6 +15019,21 @@
       <w:r>
         <w:t>Target PPM (500 Scale): 800</w:t>
       </w:r>
+    </w:p>
+    <w:p>
+      <w:pPr>
+        <w:pStyle w:val="ListParagraph"/>
+      </w:pPr>
+    </w:p>
+    <w:p>
+      <w:pPr>
+        <w:pStyle w:val="ListParagraph"/>
+      </w:pPr>
+    </w:p>
+    <w:p>
+      <w:pPr>
+        <w:pStyle w:val="ListParagraph"/>
+      </w:pPr>
     </w:p>
     <w:p>
       <w:pPr>
@@ -15376,7 +15435,6 @@
           <w:b/>
           <w:bCs/>
         </w:rPr>
-        <w:lastRenderedPageBreak/>
         <w:t>Crop Category Coverage</w:t>
       </w:r>
     </w:p>
@@ -16801,7 +16859,6 @@
           <w:b/>
           <w:bCs/>
         </w:rPr>
-        <w:lastRenderedPageBreak/>
         <w:t>Potassium Management</w:t>
       </w:r>
     </w:p>
@@ -18127,6 +18184,7 @@
         <w:pStyle w:val="ListParagraph"/>
       </w:pPr>
       <w:r>
+        <w:lastRenderedPageBreak/>
         <w:t>Target PPM (500 Scale): 900–1100</w:t>
       </w:r>
     </w:p>
@@ -18902,6 +18960,7 @@
           <w:b/>
           <w:bCs/>
         </w:rPr>
+        <w:lastRenderedPageBreak/>
         <w:t>Source:</w:t>
       </w:r>
       <w:r>
@@ -19281,6 +19340,7 @@
           </w:tcPr>
           <w:p>
             <w:r>
+              <w:lastRenderedPageBreak/>
               <w:t>Potassium (K⁺)</w:t>
             </w:r>
           </w:p>
@@ -19407,7 +19467,6 @@
           <w:sz w:val="28"/>
           <w:szCs w:val="28"/>
         </w:rPr>
-        <w:lastRenderedPageBreak/>
         <w:pict w14:anchorId="3D5E1FF8">
           <v:rect id="_x0000_i1025" style="width:0;height:1.5pt" o:hralign="center" o:hrstd="t" o:hr="t" fillcolor="#a0a0a0" stroked="f"/>
         </w:pict>
@@ -19706,6 +19765,7 @@
           </w:tcPr>
           <w:p>
             <w:r>
+              <w:lastRenderedPageBreak/>
               <w:t>Potassium (K)</w:t>
             </w:r>
           </w:p>
@@ -20219,6 +20279,7 @@
           <w:p>
             <w:proofErr w:type="spellStart"/>
             <w:r>
+              <w:lastRenderedPageBreak/>
               <w:t>Sulfur</w:t>
             </w:r>
             <w:proofErr w:type="spellEnd"/>
@@ -20670,7 +20731,6 @@
         </w:rPr>
       </w:pPr>
       <w:r>
-        <w:lastRenderedPageBreak/>
         <w:t xml:space="preserve">                                                                  </w:t>
       </w:r>
       <w:r>
@@ -21262,6 +21322,9 @@
       </w:r>
       <w:r>
         <w:br/>
+      </w:r>
+      <w:r>
+        <w:lastRenderedPageBreak/>
         <w:t>• Identify harmful ions (Na, Cl, HCO₃)</w:t>
       </w:r>
       <w:r>
@@ -21653,6 +21716,9 @@
       </w:r>
       <w:r>
         <w:br/>
+      </w:r>
+      <w:r>
+        <w:lastRenderedPageBreak/>
         <w:t>↓</w:t>
       </w:r>
       <w:r>
@@ -22583,6 +22649,7 @@
                 <w:b/>
                 <w:bCs/>
               </w:rPr>
+              <w:lastRenderedPageBreak/>
               <w:t>Nutrient</w:t>
             </w:r>
           </w:p>
@@ -24104,6 +24171,7 @@
         <w:spacing w:after="0" w:line="240" w:lineRule="auto"/>
       </w:pPr>
       <w:r>
+        <w:lastRenderedPageBreak/>
         <w:t>Subject to:</w:t>
       </w:r>
     </w:p>
@@ -24635,6 +24703,287 @@
     </w:p>
     <w:p>
       <w:pPr>
+        <w:spacing w:after="0" w:line="240" w:lineRule="auto"/>
+      </w:pPr>
+    </w:p>
+    <w:p>
+      <w:pPr>
+        <w:spacing w:after="0" w:line="240" w:lineRule="auto"/>
+      </w:pPr>
+    </w:p>
+    <w:p>
+      <w:pPr>
+        <w:spacing w:after="0" w:line="240" w:lineRule="auto"/>
+      </w:pPr>
+    </w:p>
+    <w:p>
+      <w:pPr>
+        <w:spacing w:after="0" w:line="240" w:lineRule="auto"/>
+      </w:pPr>
+    </w:p>
+    <w:p>
+      <w:pPr>
+        <w:spacing w:after="0" w:line="240" w:lineRule="auto"/>
+      </w:pPr>
+      <w:r>
+        <w:t>(01/07/2026</w:t>
+      </w:r>
+      <w:proofErr w:type="gramStart"/>
+      <w:r>
+        <w:t>)  writing</w:t>
+      </w:r>
+      <w:proofErr w:type="gramEnd"/>
+      <w:r>
+        <w:t xml:space="preserve"> the firmware modules for each sensor and pumps </w:t>
+      </w:r>
+    </w:p>
+    <w:p>
+      <w:pPr>
+        <w:spacing w:after="0" w:line="240" w:lineRule="auto"/>
+      </w:pPr>
+    </w:p>
+    <w:p>
+      <w:pPr>
+        <w:spacing w:after="0" w:line="240" w:lineRule="auto"/>
+      </w:pPr>
+    </w:p>
+    <w:p>
+      <w:pPr>
+        <w:spacing w:after="0" w:line="240" w:lineRule="auto"/>
+      </w:pPr>
+      <w:r>
+        <w:t>(04/07/2026</w:t>
+      </w:r>
+      <w:proofErr w:type="gramStart"/>
+      <w:r>
+        <w:t>)  writing</w:t>
+      </w:r>
+      <w:proofErr w:type="gramEnd"/>
+      <w:r>
+        <w:t xml:space="preserve"> the sensor and dosing manager modules for the project I am planning to use </w:t>
+      </w:r>
+      <w:proofErr w:type="spellStart"/>
+      <w:r>
+        <w:t>rtos</w:t>
+      </w:r>
+      <w:proofErr w:type="spellEnd"/>
+      <w:r>
+        <w:t xml:space="preserve"> or </w:t>
+      </w:r>
+      <w:proofErr w:type="spellStart"/>
+      <w:r>
+        <w:t>fsm</w:t>
+      </w:r>
+      <w:proofErr w:type="spellEnd"/>
+      <w:r>
+        <w:t xml:space="preserve"> for this </w:t>
+      </w:r>
+      <w:proofErr w:type="gramStart"/>
+      <w:r>
+        <w:t>project  currently</w:t>
+      </w:r>
+      <w:proofErr w:type="gramEnd"/>
+      <w:r>
+        <w:t xml:space="preserve"> the main issue is I don’t </w:t>
+      </w:r>
+      <w:proofErr w:type="spellStart"/>
+      <w:r>
+        <w:t>now</w:t>
+      </w:r>
+      <w:proofErr w:type="spellEnd"/>
+      <w:r>
+        <w:t xml:space="preserve"> how </w:t>
+      </w:r>
+      <w:proofErr w:type="spellStart"/>
+      <w:r>
+        <w:t>iam</w:t>
+      </w:r>
+      <w:proofErr w:type="spellEnd"/>
+      <w:r>
+        <w:t xml:space="preserve"> going to integrate the device with the dashboard that thing and the dashboard I have created it with the antigravity using react.</w:t>
+      </w:r>
+    </w:p>
+    <w:p>
+      <w:pPr>
+        <w:spacing w:after="0" w:line="240" w:lineRule="auto"/>
+      </w:pPr>
+      <w:proofErr w:type="gramStart"/>
+      <w:r>
+        <w:t>Also</w:t>
+      </w:r>
+      <w:proofErr w:type="gramEnd"/>
+      <w:r>
+        <w:t xml:space="preserve"> </w:t>
+      </w:r>
+      <w:proofErr w:type="spellStart"/>
+      <w:r>
+        <w:t>iam</w:t>
+      </w:r>
+      <w:proofErr w:type="spellEnd"/>
+      <w:r>
+        <w:t xml:space="preserve"> planning to create a mobile app </w:t>
+      </w:r>
+      <w:proofErr w:type="gramStart"/>
+      <w:r>
+        <w:t>may be</w:t>
+      </w:r>
+      <w:proofErr w:type="gramEnd"/>
+      <w:r>
+        <w:t xml:space="preserve"> I will plan for that later </w:t>
+      </w:r>
+    </w:p>
+    <w:p>
+      <w:pPr>
+        <w:spacing w:after="0" w:line="240" w:lineRule="auto"/>
+      </w:pPr>
+    </w:p>
+    <w:p>
+      <w:pPr>
+        <w:pStyle w:val="ListParagraph"/>
+        <w:numPr>
+          <w:ilvl w:val="1"/>
+          <w:numId w:val="23"/>
+        </w:numPr>
+        <w:spacing w:after="0" w:line="240" w:lineRule="auto"/>
+      </w:pPr>
+      <w:proofErr w:type="gramStart"/>
+      <w:r>
+        <w:t>So  today</w:t>
+      </w:r>
+      <w:proofErr w:type="gramEnd"/>
+      <w:r>
+        <w:t xml:space="preserve"> I have created modules for </w:t>
+      </w:r>
+      <w:proofErr w:type="spellStart"/>
+      <w:r>
+        <w:t>pump_</w:t>
+      </w:r>
+      <w:proofErr w:type="gramStart"/>
+      <w:r>
+        <w:t>calibration</w:t>
+      </w:r>
+      <w:proofErr w:type="spellEnd"/>
+      <w:r>
+        <w:t xml:space="preserve"> ,</w:t>
+      </w:r>
+      <w:proofErr w:type="spellStart"/>
+      <w:r>
+        <w:t>dosing</w:t>
+      </w:r>
+      <w:proofErr w:type="gramEnd"/>
+      <w:r>
+        <w:t>_</w:t>
+      </w:r>
+      <w:proofErr w:type="gramStart"/>
+      <w:r>
+        <w:t>manager,dosing</w:t>
+      </w:r>
+      <w:proofErr w:type="gramEnd"/>
+      <w:r>
+        <w:t>_qeue</w:t>
+      </w:r>
+      <w:proofErr w:type="spellEnd"/>
+      <w:r>
+        <w:t xml:space="preserve"> and storage manager dosing manager decides which nutrition and what quantity need to be dosed and pump calibration take care of converting the volume into the runtime based on the calibrated values and the storage manager work is to store the </w:t>
+      </w:r>
+      <w:proofErr w:type="spellStart"/>
+      <w:r>
+        <w:t>crutial</w:t>
+      </w:r>
+      <w:proofErr w:type="spellEnd"/>
+      <w:r>
+        <w:t xml:space="preserve"> calibration and setting data in non-volatile storage.</w:t>
+      </w:r>
+    </w:p>
+    <w:p>
+      <w:pPr>
+        <w:pStyle w:val="ListParagraph"/>
+        <w:numPr>
+          <w:ilvl w:val="1"/>
+          <w:numId w:val="23"/>
+        </w:numPr>
+        <w:spacing w:after="0" w:line="240" w:lineRule="auto"/>
+      </w:pPr>
+      <w:r>
+        <w:t xml:space="preserve">In the storage manager I am implementing the </w:t>
+      </w:r>
+      <w:r>
+        <w:rPr>
+          <w:b/>
+          <w:bCs/>
+        </w:rPr>
+        <w:t>CRC</w:t>
+      </w:r>
+      <w:r>
+        <w:t xml:space="preserve"> check so that if a data is corrupted in the middle we get to known by checking the </w:t>
+      </w:r>
+      <w:r>
+        <w:rPr>
+          <w:b/>
+          <w:bCs/>
+        </w:rPr>
+        <w:t>CRC</w:t>
+      </w:r>
+      <w:r>
+        <w:rPr>
+          <w:b/>
+          <w:bCs/>
+        </w:rPr>
+        <w:t xml:space="preserve"> </w:t>
+      </w:r>
+      <w:r>
+        <w:t xml:space="preserve">when we first enter the data the </w:t>
+      </w:r>
+      <w:proofErr w:type="spellStart"/>
+      <w:r>
+        <w:t>crc</w:t>
+      </w:r>
+      <w:proofErr w:type="spellEnd"/>
+      <w:r>
+        <w:t xml:space="preserve"> is </w:t>
+      </w:r>
+      <w:proofErr w:type="spellStart"/>
+      <w:r>
+        <w:t>caluculated</w:t>
+      </w:r>
+      <w:proofErr w:type="spellEnd"/>
+      <w:r>
+        <w:t xml:space="preserve"> for the data according to the bytes it is given and when the calibration or any other data is loaded the </w:t>
+      </w:r>
+      <w:proofErr w:type="spellStart"/>
+      <w:r>
+        <w:t>crc</w:t>
+      </w:r>
+      <w:proofErr w:type="spellEnd"/>
+      <w:r>
+        <w:t xml:space="preserve"> is </w:t>
+      </w:r>
+      <w:proofErr w:type="spellStart"/>
+      <w:r>
+        <w:t>recaluculated</w:t>
+      </w:r>
+      <w:proofErr w:type="spellEnd"/>
+      <w:r>
+        <w:t xml:space="preserve"> and compared with the one we have and if they are same data is fine if not it is corrupted</w:t>
+      </w:r>
+      <w:r>
+        <w:rPr>
+          <w:b/>
+          <w:bCs/>
+        </w:rPr>
+        <w:t>.</w:t>
+      </w:r>
+      <w:r>
+        <w:t xml:space="preserve"> </w:t>
+      </w:r>
+    </w:p>
+    <w:p>
+      <w:pPr>
+        <w:pStyle w:val="ListParagraph"/>
+        <w:numPr>
+          <w:ilvl w:val="1"/>
+          <w:numId w:val="23"/>
+        </w:numPr>
         <w:spacing w:after="0" w:line="240" w:lineRule="auto"/>
       </w:pPr>
     </w:p>
@@ -30072,6 +30421,7 @@
   <w:style w:type="character" w:default="1" w:styleId="DefaultParagraphFont">
     <w:name w:val="Default Paragraph Font"/>
     <w:uiPriority w:val="1"/>
+    <w:semiHidden/>
     <w:unhideWhenUsed/>
   </w:style>
   <w:style w:type="table" w:default="1" w:styleId="TableNormal">

</xml_diff>